<commit_message>
changing first and second usrveys for ethics app
</commit_message>
<xml_diff>
--- a/ethics-application/second-survey.docx
+++ b/ethics-application/second-survey.docx
@@ -89,627 +89,12 @@
       <w:pPr>
         <w:pStyle w:val="Normal"/>
         <w:spacing w:lineRule="auto" w:line="276" w:before="240" w:after="240"/>
-        <w:jc w:val="center"/>
-        <w:rPr>
-          <w:rFonts w:cs="Calibri" w:cstheme="minorHAnsi"/>
-          <w:b/>
-          <w:bCs/>
-          <w:color w:val="000000"/>
-          <w:szCs w:val="24"/>
-        </w:rPr>
+        <w:jc w:val="left"/>
+        <w:rPr/>
       </w:pPr>
       <w:r>
-        <w:rPr>
-          <w:rFonts w:cs="Calibri" w:cstheme="minorHAnsi"/>
-          <w:b/>
-          <w:bCs/>
-          <w:color w:val="000000"/>
-          <w:szCs w:val="24"/>
-        </w:rPr>
-        <w:t>Based on the 20 courses recommended to you by the AI system, please give an honest evaluation of the recommendation. Give a ‘0’ if you are dissatisfied with the recommendation, and a ‘1’ if you are satisfied with the recommendation.</w:t>
-      </w:r>
-    </w:p>
-    <w:p>
-      <w:pPr>
-        <w:pStyle w:val="Normal"/>
-        <w:spacing w:lineRule="auto" w:line="276" w:before="240" w:after="240"/>
-        <w:jc w:val="center"/>
-        <w:rPr>
-          <w:rFonts w:cs="Calibri" w:cstheme="minorHAnsi"/>
-          <w:b/>
-          <w:bCs/>
-          <w:color w:val="000000"/>
-          <w:szCs w:val="24"/>
-        </w:rPr>
-      </w:pPr>
-      <w:r>
-        <w:rPr>
-          <w:rFonts w:cs="Calibri" w:cstheme="minorHAnsi"/>
-          <w:b/>
-          <w:bCs/>
-          <w:color w:val="000000"/>
-          <w:szCs w:val="24"/>
-        </w:rPr>
-      </w:r>
-    </w:p>
-    <w:p>
-      <w:pPr>
-        <w:pStyle w:val="Normal"/>
-        <w:spacing w:lineRule="auto" w:line="276" w:before="240" w:after="240"/>
-        <w:jc w:val="center"/>
-        <w:rPr>
-          <w:rFonts w:cs="Calibri" w:cstheme="minorHAnsi"/>
-          <w:b w:val="false"/>
-          <w:bCs w:val="false"/>
-          <w:i/>
-          <w:i/>
-          <w:iCs/>
-          <w:color w:val="000000"/>
-          <w:szCs w:val="24"/>
-        </w:rPr>
-      </w:pPr>
-      <w:r>
-        <w:rPr>
-          <w:rFonts w:cs="Calibri" w:cstheme="minorHAnsi"/>
-          <w:b w:val="false"/>
-          <w:bCs w:val="false"/>
-          <w:i/>
-          <w:iCs/>
-          <w:color w:val="000000"/>
-          <w:szCs w:val="24"/>
-        </w:rPr>
-        <w:t>1. Course 1:</w:t>
-      </w:r>
-    </w:p>
-    <w:p>
-      <w:pPr>
-        <w:pStyle w:val="Normal"/>
-        <w:spacing w:lineRule="auto" w:line="276" w:before="240" w:after="240"/>
-        <w:jc w:val="center"/>
-        <w:rPr>
-          <w:rFonts w:cs="Calibri" w:cstheme="minorHAnsi"/>
-          <w:b w:val="false"/>
-          <w:bCs w:val="false"/>
-          <w:i/>
-          <w:i/>
-          <w:iCs/>
-          <w:color w:val="000000"/>
-          <w:szCs w:val="24"/>
-        </w:rPr>
-      </w:pPr>
-      <w:r>
-        <w:rPr>
-          <w:rFonts w:cs="Calibri" w:cstheme="minorHAnsi"/>
-          <w:b w:val="false"/>
-          <w:bCs w:val="false"/>
-          <w:i/>
-          <w:iCs/>
-          <w:color w:val="000000"/>
-          <w:szCs w:val="24"/>
-        </w:rPr>
-        <w:t>2. Course 2:</w:t>
-      </w:r>
-    </w:p>
-    <w:p>
-      <w:pPr>
-        <w:pStyle w:val="Normal"/>
-        <w:spacing w:lineRule="auto" w:line="276" w:before="240" w:after="240"/>
-        <w:jc w:val="center"/>
-        <w:rPr>
-          <w:rFonts w:cs="Calibri" w:cstheme="minorHAnsi"/>
-          <w:b w:val="false"/>
-          <w:bCs w:val="false"/>
-          <w:i/>
-          <w:i/>
-          <w:iCs/>
-          <w:color w:val="000000"/>
-          <w:szCs w:val="24"/>
-        </w:rPr>
-      </w:pPr>
-      <w:r>
-        <w:rPr>
-          <w:rFonts w:cs="Calibri" w:cstheme="minorHAnsi"/>
-          <w:b w:val="false"/>
-          <w:bCs w:val="false"/>
-          <w:i/>
-          <w:iCs/>
-          <w:color w:val="000000"/>
-          <w:szCs w:val="24"/>
-        </w:rPr>
-        <w:t>3. Course 3:</w:t>
-      </w:r>
-    </w:p>
-    <w:p>
-      <w:pPr>
-        <w:pStyle w:val="Normal"/>
-        <w:spacing w:lineRule="auto" w:line="276" w:before="240" w:after="240"/>
-        <w:jc w:val="center"/>
-        <w:rPr>
-          <w:rFonts w:cs="Calibri" w:cstheme="minorHAnsi"/>
-          <w:b w:val="false"/>
-          <w:bCs w:val="false"/>
-          <w:i/>
-          <w:i/>
-          <w:iCs/>
-          <w:color w:val="000000"/>
-          <w:szCs w:val="24"/>
-        </w:rPr>
-      </w:pPr>
-      <w:r>
-        <w:rPr>
-          <w:rFonts w:cs="Calibri" w:cstheme="minorHAnsi"/>
-          <w:b w:val="false"/>
-          <w:bCs w:val="false"/>
-          <w:i/>
-          <w:iCs/>
-          <w:color w:val="000000"/>
-          <w:szCs w:val="24"/>
-        </w:rPr>
-        <w:t>4. Course 4:</w:t>
-      </w:r>
-    </w:p>
-    <w:p>
-      <w:pPr>
-        <w:pStyle w:val="Normal"/>
-        <w:spacing w:lineRule="auto" w:line="276" w:before="240" w:after="240"/>
-        <w:jc w:val="center"/>
-        <w:rPr>
-          <w:rFonts w:cs="Calibri" w:cstheme="minorHAnsi"/>
-          <w:b w:val="false"/>
-          <w:bCs w:val="false"/>
-          <w:i/>
-          <w:i/>
-          <w:iCs/>
-          <w:color w:val="000000"/>
-          <w:szCs w:val="24"/>
-        </w:rPr>
-      </w:pPr>
-      <w:r>
-        <w:rPr>
-          <w:rFonts w:cs="Calibri" w:cstheme="minorHAnsi"/>
-          <w:b w:val="false"/>
-          <w:bCs w:val="false"/>
-          <w:i/>
-          <w:iCs/>
-          <w:color w:val="000000"/>
-          <w:szCs w:val="24"/>
-        </w:rPr>
-        <w:t>5. Course 5:</w:t>
-      </w:r>
-    </w:p>
-    <w:p>
-      <w:pPr>
-        <w:pStyle w:val="Normal"/>
-        <w:spacing w:lineRule="auto" w:line="276" w:before="240" w:after="240"/>
-        <w:jc w:val="center"/>
-        <w:rPr>
-          <w:rFonts w:cs="Calibri" w:cstheme="minorHAnsi"/>
-          <w:b w:val="false"/>
-          <w:bCs w:val="false"/>
-          <w:i/>
-          <w:i/>
-          <w:iCs/>
-          <w:color w:val="000000"/>
-          <w:szCs w:val="24"/>
-        </w:rPr>
-      </w:pPr>
-      <w:r>
-        <w:rPr>
-          <w:rFonts w:cs="Calibri" w:cstheme="minorHAnsi"/>
-          <w:b w:val="false"/>
-          <w:bCs w:val="false"/>
-          <w:i/>
-          <w:iCs/>
-          <w:color w:val="000000"/>
-          <w:szCs w:val="24"/>
-        </w:rPr>
-        <w:t>6. Course 6:</w:t>
-      </w:r>
-    </w:p>
-    <w:p>
-      <w:pPr>
-        <w:pStyle w:val="Normal"/>
-        <w:spacing w:lineRule="auto" w:line="276" w:before="240" w:after="240"/>
-        <w:jc w:val="center"/>
-        <w:rPr>
-          <w:rFonts w:cs="Calibri" w:cstheme="minorHAnsi"/>
-          <w:b w:val="false"/>
-          <w:bCs w:val="false"/>
-          <w:i/>
-          <w:i/>
-          <w:iCs/>
-          <w:color w:val="000000"/>
-          <w:szCs w:val="24"/>
-        </w:rPr>
-      </w:pPr>
-      <w:r>
-        <w:rPr>
-          <w:rFonts w:cs="Calibri" w:cstheme="minorHAnsi"/>
-          <w:b w:val="false"/>
-          <w:bCs w:val="false"/>
-          <w:i/>
-          <w:iCs/>
-          <w:color w:val="000000"/>
-          <w:szCs w:val="24"/>
-        </w:rPr>
-        <w:t>7. Course 7:</w:t>
-      </w:r>
-    </w:p>
-    <w:p>
-      <w:pPr>
-        <w:pStyle w:val="Normal"/>
-        <w:spacing w:lineRule="auto" w:line="276" w:before="240" w:after="240"/>
-        <w:jc w:val="center"/>
-        <w:rPr>
-          <w:rFonts w:cs="Calibri" w:cstheme="minorHAnsi"/>
-          <w:b w:val="false"/>
-          <w:bCs w:val="false"/>
-          <w:i/>
-          <w:i/>
-          <w:iCs/>
-          <w:color w:val="000000"/>
-          <w:szCs w:val="24"/>
-        </w:rPr>
-      </w:pPr>
-      <w:r>
-        <w:rPr>
-          <w:rFonts w:cs="Calibri" w:cstheme="minorHAnsi"/>
-          <w:b w:val="false"/>
-          <w:bCs w:val="false"/>
-          <w:i/>
-          <w:iCs/>
-          <w:color w:val="000000"/>
-          <w:szCs w:val="24"/>
-        </w:rPr>
-        <w:t>8. Course 8:</w:t>
-      </w:r>
-    </w:p>
-    <w:p>
-      <w:pPr>
-        <w:pStyle w:val="Normal"/>
-        <w:spacing w:lineRule="auto" w:line="276" w:before="240" w:after="240"/>
-        <w:jc w:val="center"/>
-        <w:rPr>
-          <w:rFonts w:cs="Calibri" w:cstheme="minorHAnsi"/>
-          <w:b w:val="false"/>
-          <w:bCs w:val="false"/>
-          <w:i/>
-          <w:i/>
-          <w:iCs/>
-          <w:color w:val="000000"/>
-          <w:szCs w:val="24"/>
-        </w:rPr>
-      </w:pPr>
-      <w:r>
-        <w:rPr>
-          <w:rFonts w:cs="Calibri" w:cstheme="minorHAnsi"/>
-          <w:b w:val="false"/>
-          <w:bCs w:val="false"/>
-          <w:i/>
-          <w:iCs/>
-          <w:color w:val="000000"/>
-          <w:szCs w:val="24"/>
-        </w:rPr>
-        <w:t>9. Course 9:</w:t>
-      </w:r>
-    </w:p>
-    <w:p>
-      <w:pPr>
-        <w:pStyle w:val="Normal"/>
-        <w:spacing w:lineRule="auto" w:line="276" w:before="240" w:after="240"/>
-        <w:jc w:val="center"/>
-        <w:rPr>
-          <w:rFonts w:cs="Calibri" w:cstheme="minorHAnsi"/>
-          <w:b w:val="false"/>
-          <w:bCs w:val="false"/>
-          <w:i/>
-          <w:i/>
-          <w:iCs/>
-          <w:color w:val="000000"/>
-          <w:szCs w:val="24"/>
-        </w:rPr>
-      </w:pPr>
-      <w:r>
-        <w:rPr>
-          <w:rFonts w:cs="Calibri" w:cstheme="minorHAnsi"/>
-          <w:b w:val="false"/>
-          <w:bCs w:val="false"/>
-          <w:i/>
-          <w:iCs/>
-          <w:color w:val="000000"/>
-          <w:szCs w:val="24"/>
-        </w:rPr>
-        <w:t>10. Course 10:</w:t>
-      </w:r>
-    </w:p>
-    <w:p>
-      <w:pPr>
-        <w:pStyle w:val="Normal"/>
-        <w:spacing w:lineRule="auto" w:line="276" w:before="240" w:after="240"/>
-        <w:jc w:val="center"/>
-        <w:rPr>
-          <w:rFonts w:cs="Calibri" w:cstheme="minorHAnsi"/>
-          <w:b w:val="false"/>
-          <w:bCs w:val="false"/>
-          <w:i/>
-          <w:i/>
-          <w:iCs/>
-          <w:color w:val="000000"/>
-          <w:szCs w:val="24"/>
-        </w:rPr>
-      </w:pPr>
-      <w:r>
-        <w:rPr>
-          <w:rFonts w:cs="Calibri" w:cstheme="minorHAnsi"/>
-          <w:b w:val="false"/>
-          <w:bCs w:val="false"/>
-          <w:i/>
-          <w:iCs/>
-          <w:color w:val="000000"/>
-          <w:szCs w:val="24"/>
-        </w:rPr>
-        <w:t>11. Course 11:</w:t>
-      </w:r>
-    </w:p>
-    <w:p>
-      <w:pPr>
-        <w:pStyle w:val="Normal"/>
-        <w:spacing w:lineRule="auto" w:line="276" w:before="240" w:after="240"/>
-        <w:jc w:val="center"/>
-        <w:rPr>
-          <w:rFonts w:cs="Calibri" w:cstheme="minorHAnsi"/>
-          <w:b w:val="false"/>
-          <w:bCs w:val="false"/>
-          <w:i/>
-          <w:i/>
-          <w:iCs/>
-          <w:color w:val="000000"/>
-          <w:szCs w:val="24"/>
-        </w:rPr>
-      </w:pPr>
-      <w:r>
-        <w:rPr>
-          <w:rFonts w:cs="Calibri" w:cstheme="minorHAnsi"/>
-          <w:b w:val="false"/>
-          <w:bCs w:val="false"/>
-          <w:i/>
-          <w:iCs/>
-          <w:color w:val="000000"/>
-          <w:szCs w:val="24"/>
-        </w:rPr>
-        <w:t>12. Course 12:</w:t>
-      </w:r>
-    </w:p>
-    <w:p>
-      <w:pPr>
-        <w:pStyle w:val="Normal"/>
-        <w:spacing w:lineRule="auto" w:line="276" w:before="240" w:after="240"/>
-        <w:jc w:val="center"/>
-        <w:rPr>
-          <w:rFonts w:cs="Calibri" w:cstheme="minorHAnsi"/>
-          <w:b w:val="false"/>
-          <w:bCs w:val="false"/>
-          <w:i/>
-          <w:i/>
-          <w:iCs/>
-          <w:color w:val="000000"/>
-          <w:szCs w:val="24"/>
-        </w:rPr>
-      </w:pPr>
-      <w:r>
-        <w:rPr>
-          <w:rFonts w:cs="Calibri" w:cstheme="minorHAnsi"/>
-          <w:b w:val="false"/>
-          <w:bCs w:val="false"/>
-          <w:i/>
-          <w:iCs/>
-          <w:color w:val="000000"/>
-          <w:szCs w:val="24"/>
-        </w:rPr>
-        <w:t>13. Course 13:</w:t>
-      </w:r>
-    </w:p>
-    <w:p>
-      <w:pPr>
-        <w:pStyle w:val="Normal"/>
-        <w:spacing w:lineRule="auto" w:line="276" w:before="240" w:after="240"/>
-        <w:jc w:val="center"/>
-        <w:rPr>
-          <w:rFonts w:cs="Calibri" w:cstheme="minorHAnsi"/>
-          <w:b w:val="false"/>
-          <w:bCs w:val="false"/>
-          <w:i/>
-          <w:i/>
-          <w:iCs/>
-          <w:color w:val="000000"/>
-          <w:szCs w:val="24"/>
-        </w:rPr>
-      </w:pPr>
-      <w:r>
-        <w:rPr>
-          <w:rFonts w:cs="Calibri" w:cstheme="minorHAnsi"/>
-          <w:b w:val="false"/>
-          <w:bCs w:val="false"/>
-          <w:i/>
-          <w:iCs/>
-          <w:color w:val="000000"/>
-          <w:szCs w:val="24"/>
-        </w:rPr>
-        <w:t>14. Course 14:</w:t>
-      </w:r>
-    </w:p>
-    <w:p>
-      <w:pPr>
-        <w:pStyle w:val="Normal"/>
-        <w:spacing w:lineRule="auto" w:line="276" w:before="240" w:after="240"/>
-        <w:jc w:val="center"/>
-        <w:rPr>
-          <w:rFonts w:cs="Calibri" w:cstheme="minorHAnsi"/>
-          <w:b w:val="false"/>
-          <w:bCs w:val="false"/>
-          <w:i/>
-          <w:i/>
-          <w:iCs/>
-          <w:color w:val="000000"/>
-          <w:szCs w:val="24"/>
-        </w:rPr>
-      </w:pPr>
-      <w:r>
-        <w:rPr>
-          <w:rFonts w:cs="Calibri" w:cstheme="minorHAnsi"/>
-          <w:b w:val="false"/>
-          <w:bCs w:val="false"/>
-          <w:i/>
-          <w:iCs/>
-          <w:color w:val="000000"/>
-          <w:szCs w:val="24"/>
-        </w:rPr>
-        <w:t>15. Course 15:</w:t>
-      </w:r>
-    </w:p>
-    <w:p>
-      <w:pPr>
-        <w:pStyle w:val="Normal"/>
-        <w:spacing w:lineRule="auto" w:line="276" w:before="240" w:after="240"/>
-        <w:jc w:val="center"/>
-        <w:rPr>
-          <w:rFonts w:cs="Calibri" w:cstheme="minorHAnsi"/>
-          <w:b w:val="false"/>
-          <w:bCs w:val="false"/>
-          <w:i/>
-          <w:i/>
-          <w:iCs/>
-          <w:color w:val="000000"/>
-          <w:szCs w:val="24"/>
-        </w:rPr>
-      </w:pPr>
-      <w:r>
-        <w:rPr>
-          <w:rFonts w:cs="Calibri" w:cstheme="minorHAnsi"/>
-          <w:b w:val="false"/>
-          <w:bCs w:val="false"/>
-          <w:i/>
-          <w:iCs/>
-          <w:color w:val="000000"/>
-          <w:szCs w:val="24"/>
-        </w:rPr>
-        <w:t>16. Course 16:</w:t>
-      </w:r>
-    </w:p>
-    <w:p>
-      <w:pPr>
-        <w:pStyle w:val="Normal"/>
-        <w:spacing w:lineRule="auto" w:line="276" w:before="240" w:after="240"/>
-        <w:jc w:val="center"/>
-        <w:rPr>
-          <w:rFonts w:cs="Calibri" w:cstheme="minorHAnsi"/>
-          <w:b w:val="false"/>
-          <w:bCs w:val="false"/>
-          <w:i/>
-          <w:i/>
-          <w:iCs/>
-          <w:color w:val="000000"/>
-          <w:szCs w:val="24"/>
-        </w:rPr>
-      </w:pPr>
-      <w:r>
-        <w:rPr>
-          <w:rFonts w:cs="Calibri" w:cstheme="minorHAnsi"/>
-          <w:b w:val="false"/>
-          <w:bCs w:val="false"/>
-          <w:i/>
-          <w:iCs/>
-          <w:color w:val="000000"/>
-          <w:szCs w:val="24"/>
-        </w:rPr>
-        <w:t>17. Course 17:</w:t>
-      </w:r>
-    </w:p>
-    <w:p>
-      <w:pPr>
-        <w:pStyle w:val="Normal"/>
-        <w:spacing w:lineRule="auto" w:line="276" w:before="240" w:after="240"/>
-        <w:jc w:val="center"/>
-        <w:rPr>
-          <w:rFonts w:cs="Calibri" w:cstheme="minorHAnsi"/>
-          <w:b w:val="false"/>
-          <w:bCs w:val="false"/>
-          <w:i/>
-          <w:i/>
-          <w:iCs/>
-          <w:color w:val="000000"/>
-          <w:szCs w:val="24"/>
-        </w:rPr>
-      </w:pPr>
-      <w:r>
-        <w:rPr>
-          <w:rFonts w:cs="Calibri" w:cstheme="minorHAnsi"/>
-          <w:b w:val="false"/>
-          <w:bCs w:val="false"/>
-          <w:i/>
-          <w:iCs/>
-          <w:color w:val="000000"/>
-          <w:szCs w:val="24"/>
-        </w:rPr>
-        <w:t>18. Course 18:</w:t>
-      </w:r>
-    </w:p>
-    <w:p>
-      <w:pPr>
-        <w:pStyle w:val="Normal"/>
-        <w:spacing w:lineRule="auto" w:line="276" w:before="240" w:after="240"/>
-        <w:jc w:val="center"/>
-        <w:rPr>
-          <w:rFonts w:cs="Calibri" w:cstheme="minorHAnsi"/>
-          <w:b w:val="false"/>
-          <w:bCs w:val="false"/>
-          <w:i/>
-          <w:i/>
-          <w:iCs/>
-          <w:color w:val="000000"/>
-          <w:szCs w:val="24"/>
-        </w:rPr>
-      </w:pPr>
-      <w:r>
-        <w:rPr>
-          <w:rFonts w:cs="Calibri" w:cstheme="minorHAnsi"/>
-          <w:b w:val="false"/>
-          <w:bCs w:val="false"/>
-          <w:i/>
-          <w:iCs/>
-          <w:color w:val="000000"/>
-          <w:szCs w:val="24"/>
-        </w:rPr>
-        <w:t>19. Course 19:</w:t>
-      </w:r>
-    </w:p>
-    <w:p>
-      <w:pPr>
-        <w:pStyle w:val="Normal"/>
-        <w:spacing w:lineRule="auto" w:line="276" w:before="240" w:after="240"/>
-        <w:jc w:val="center"/>
-        <w:rPr>
-          <w:rFonts w:cs="Calibri" w:cstheme="minorHAnsi"/>
-          <w:b w:val="false"/>
-          <w:bCs w:val="false"/>
-          <w:i/>
-          <w:i/>
-          <w:iCs/>
-          <w:color w:val="000000"/>
-          <w:szCs w:val="24"/>
-        </w:rPr>
-      </w:pPr>
-      <w:r>
-        <w:rPr>
-          <w:rFonts w:cs="Calibri" w:cstheme="minorHAnsi"/>
-          <w:b w:val="false"/>
-          <w:bCs w:val="false"/>
-          <w:i/>
-          <w:iCs/>
-          <w:color w:val="000000"/>
-          <w:szCs w:val="24"/>
-        </w:rPr>
-        <w:t>20. Course 20:</w:t>
+        <w:rPr/>
+        <w:t>https://docs.google.com/forms/d/e/1FAIpQLSclmDbKT1N4lTgv0f9O6mcqZYT5fAIXhb5qP-gPJktH_h75QQ/viewform</w:t>
       </w:r>
     </w:p>
     <w:sectPr>
@@ -797,7 +182,7 @@
     <w:r>
       <w:rPr/>
       <w:drawing>
-        <wp:anchor behindDoc="0" distT="0" distB="0" distL="114300" distR="114300" simplePos="0" locked="0" layoutInCell="0" allowOverlap="1" relativeHeight="3">
+        <wp:anchor behindDoc="0" distT="0" distB="0" distL="114300" distR="114300" simplePos="0" locked="0" layoutInCell="0" allowOverlap="1" relativeHeight="2">
           <wp:simplePos x="0" y="0"/>
           <wp:positionH relativeFrom="column">
             <wp:posOffset>-390525</wp:posOffset>
@@ -810,9 +195,9 @@
           <wp:wrapTight wrapText="bothSides">
             <wp:wrapPolygon edited="0">
               <wp:start x="-12" y="0"/>
-              <wp:lineTo x="-12" y="20820"/>
-              <wp:lineTo x="21447" y="20820"/>
-              <wp:lineTo x="21447" y="0"/>
+              <wp:lineTo x="-12" y="20783"/>
+              <wp:lineTo x="21435" y="20783"/>
+              <wp:lineTo x="21435" y="0"/>
               <wp:lineTo x="-12" y="0"/>
             </wp:wrapPolygon>
           </wp:wrapTight>
@@ -865,7 +250,7 @@
     <w:r>
       <w:rPr/>
       <w:drawing>
-        <wp:anchor behindDoc="0" distT="0" distB="0" distL="114300" distR="114300" simplePos="0" locked="0" layoutInCell="0" allowOverlap="1" relativeHeight="3">
+        <wp:anchor behindDoc="0" distT="0" distB="0" distL="114300" distR="114300" simplePos="0" locked="0" layoutInCell="0" allowOverlap="1" relativeHeight="2">
           <wp:simplePos x="0" y="0"/>
           <wp:positionH relativeFrom="column">
             <wp:posOffset>-390525</wp:posOffset>
@@ -878,9 +263,9 @@
           <wp:wrapTight wrapText="bothSides">
             <wp:wrapPolygon edited="0">
               <wp:start x="-12" y="0"/>
-              <wp:lineTo x="-12" y="20820"/>
-              <wp:lineTo x="21447" y="20820"/>
-              <wp:lineTo x="21447" y="0"/>
+              <wp:lineTo x="-12" y="20783"/>
+              <wp:lineTo x="21435" y="20783"/>
+              <wp:lineTo x="21435" y="0"/>
               <wp:lineTo x="-12" y="0"/>
             </wp:wrapPolygon>
           </wp:wrapTight>

</xml_diff>

<commit_message>
Removing sub string match (#13)
* removing substring match

* changing first and second usrveys for ethics app

* deleting survey txts

* trivial changes
</commit_message>
<xml_diff>
--- a/ethics-application/second-survey.docx
+++ b/ethics-application/second-survey.docx
@@ -89,627 +89,12 @@
       <w:pPr>
         <w:pStyle w:val="Normal"/>
         <w:spacing w:lineRule="auto" w:line="276" w:before="240" w:after="240"/>
-        <w:jc w:val="center"/>
-        <w:rPr>
-          <w:rFonts w:cs="Calibri" w:cstheme="minorHAnsi"/>
-          <w:b/>
-          <w:bCs/>
-          <w:color w:val="000000"/>
-          <w:szCs w:val="24"/>
-        </w:rPr>
+        <w:jc w:val="left"/>
+        <w:rPr/>
       </w:pPr>
       <w:r>
-        <w:rPr>
-          <w:rFonts w:cs="Calibri" w:cstheme="minorHAnsi"/>
-          <w:b/>
-          <w:bCs/>
-          <w:color w:val="000000"/>
-          <w:szCs w:val="24"/>
-        </w:rPr>
-        <w:t>Based on the 20 courses recommended to you by the AI system, please give an honest evaluation of the recommendation. Give a ‘0’ if you are dissatisfied with the recommendation, and a ‘1’ if you are satisfied with the recommendation.</w:t>
-      </w:r>
-    </w:p>
-    <w:p>
-      <w:pPr>
-        <w:pStyle w:val="Normal"/>
-        <w:spacing w:lineRule="auto" w:line="276" w:before="240" w:after="240"/>
-        <w:jc w:val="center"/>
-        <w:rPr>
-          <w:rFonts w:cs="Calibri" w:cstheme="minorHAnsi"/>
-          <w:b/>
-          <w:bCs/>
-          <w:color w:val="000000"/>
-          <w:szCs w:val="24"/>
-        </w:rPr>
-      </w:pPr>
-      <w:r>
-        <w:rPr>
-          <w:rFonts w:cs="Calibri" w:cstheme="minorHAnsi"/>
-          <w:b/>
-          <w:bCs/>
-          <w:color w:val="000000"/>
-          <w:szCs w:val="24"/>
-        </w:rPr>
-      </w:r>
-    </w:p>
-    <w:p>
-      <w:pPr>
-        <w:pStyle w:val="Normal"/>
-        <w:spacing w:lineRule="auto" w:line="276" w:before="240" w:after="240"/>
-        <w:jc w:val="center"/>
-        <w:rPr>
-          <w:rFonts w:cs="Calibri" w:cstheme="minorHAnsi"/>
-          <w:b w:val="false"/>
-          <w:bCs w:val="false"/>
-          <w:i/>
-          <w:i/>
-          <w:iCs/>
-          <w:color w:val="000000"/>
-          <w:szCs w:val="24"/>
-        </w:rPr>
-      </w:pPr>
-      <w:r>
-        <w:rPr>
-          <w:rFonts w:cs="Calibri" w:cstheme="minorHAnsi"/>
-          <w:b w:val="false"/>
-          <w:bCs w:val="false"/>
-          <w:i/>
-          <w:iCs/>
-          <w:color w:val="000000"/>
-          <w:szCs w:val="24"/>
-        </w:rPr>
-        <w:t>1. Course 1:</w:t>
-      </w:r>
-    </w:p>
-    <w:p>
-      <w:pPr>
-        <w:pStyle w:val="Normal"/>
-        <w:spacing w:lineRule="auto" w:line="276" w:before="240" w:after="240"/>
-        <w:jc w:val="center"/>
-        <w:rPr>
-          <w:rFonts w:cs="Calibri" w:cstheme="minorHAnsi"/>
-          <w:b w:val="false"/>
-          <w:bCs w:val="false"/>
-          <w:i/>
-          <w:i/>
-          <w:iCs/>
-          <w:color w:val="000000"/>
-          <w:szCs w:val="24"/>
-        </w:rPr>
-      </w:pPr>
-      <w:r>
-        <w:rPr>
-          <w:rFonts w:cs="Calibri" w:cstheme="minorHAnsi"/>
-          <w:b w:val="false"/>
-          <w:bCs w:val="false"/>
-          <w:i/>
-          <w:iCs/>
-          <w:color w:val="000000"/>
-          <w:szCs w:val="24"/>
-        </w:rPr>
-        <w:t>2. Course 2:</w:t>
-      </w:r>
-    </w:p>
-    <w:p>
-      <w:pPr>
-        <w:pStyle w:val="Normal"/>
-        <w:spacing w:lineRule="auto" w:line="276" w:before="240" w:after="240"/>
-        <w:jc w:val="center"/>
-        <w:rPr>
-          <w:rFonts w:cs="Calibri" w:cstheme="minorHAnsi"/>
-          <w:b w:val="false"/>
-          <w:bCs w:val="false"/>
-          <w:i/>
-          <w:i/>
-          <w:iCs/>
-          <w:color w:val="000000"/>
-          <w:szCs w:val="24"/>
-        </w:rPr>
-      </w:pPr>
-      <w:r>
-        <w:rPr>
-          <w:rFonts w:cs="Calibri" w:cstheme="minorHAnsi"/>
-          <w:b w:val="false"/>
-          <w:bCs w:val="false"/>
-          <w:i/>
-          <w:iCs/>
-          <w:color w:val="000000"/>
-          <w:szCs w:val="24"/>
-        </w:rPr>
-        <w:t>3. Course 3:</w:t>
-      </w:r>
-    </w:p>
-    <w:p>
-      <w:pPr>
-        <w:pStyle w:val="Normal"/>
-        <w:spacing w:lineRule="auto" w:line="276" w:before="240" w:after="240"/>
-        <w:jc w:val="center"/>
-        <w:rPr>
-          <w:rFonts w:cs="Calibri" w:cstheme="minorHAnsi"/>
-          <w:b w:val="false"/>
-          <w:bCs w:val="false"/>
-          <w:i/>
-          <w:i/>
-          <w:iCs/>
-          <w:color w:val="000000"/>
-          <w:szCs w:val="24"/>
-        </w:rPr>
-      </w:pPr>
-      <w:r>
-        <w:rPr>
-          <w:rFonts w:cs="Calibri" w:cstheme="minorHAnsi"/>
-          <w:b w:val="false"/>
-          <w:bCs w:val="false"/>
-          <w:i/>
-          <w:iCs/>
-          <w:color w:val="000000"/>
-          <w:szCs w:val="24"/>
-        </w:rPr>
-        <w:t>4. Course 4:</w:t>
-      </w:r>
-    </w:p>
-    <w:p>
-      <w:pPr>
-        <w:pStyle w:val="Normal"/>
-        <w:spacing w:lineRule="auto" w:line="276" w:before="240" w:after="240"/>
-        <w:jc w:val="center"/>
-        <w:rPr>
-          <w:rFonts w:cs="Calibri" w:cstheme="minorHAnsi"/>
-          <w:b w:val="false"/>
-          <w:bCs w:val="false"/>
-          <w:i/>
-          <w:i/>
-          <w:iCs/>
-          <w:color w:val="000000"/>
-          <w:szCs w:val="24"/>
-        </w:rPr>
-      </w:pPr>
-      <w:r>
-        <w:rPr>
-          <w:rFonts w:cs="Calibri" w:cstheme="minorHAnsi"/>
-          <w:b w:val="false"/>
-          <w:bCs w:val="false"/>
-          <w:i/>
-          <w:iCs/>
-          <w:color w:val="000000"/>
-          <w:szCs w:val="24"/>
-        </w:rPr>
-        <w:t>5. Course 5:</w:t>
-      </w:r>
-    </w:p>
-    <w:p>
-      <w:pPr>
-        <w:pStyle w:val="Normal"/>
-        <w:spacing w:lineRule="auto" w:line="276" w:before="240" w:after="240"/>
-        <w:jc w:val="center"/>
-        <w:rPr>
-          <w:rFonts w:cs="Calibri" w:cstheme="minorHAnsi"/>
-          <w:b w:val="false"/>
-          <w:bCs w:val="false"/>
-          <w:i/>
-          <w:i/>
-          <w:iCs/>
-          <w:color w:val="000000"/>
-          <w:szCs w:val="24"/>
-        </w:rPr>
-      </w:pPr>
-      <w:r>
-        <w:rPr>
-          <w:rFonts w:cs="Calibri" w:cstheme="minorHAnsi"/>
-          <w:b w:val="false"/>
-          <w:bCs w:val="false"/>
-          <w:i/>
-          <w:iCs/>
-          <w:color w:val="000000"/>
-          <w:szCs w:val="24"/>
-        </w:rPr>
-        <w:t>6. Course 6:</w:t>
-      </w:r>
-    </w:p>
-    <w:p>
-      <w:pPr>
-        <w:pStyle w:val="Normal"/>
-        <w:spacing w:lineRule="auto" w:line="276" w:before="240" w:after="240"/>
-        <w:jc w:val="center"/>
-        <w:rPr>
-          <w:rFonts w:cs="Calibri" w:cstheme="minorHAnsi"/>
-          <w:b w:val="false"/>
-          <w:bCs w:val="false"/>
-          <w:i/>
-          <w:i/>
-          <w:iCs/>
-          <w:color w:val="000000"/>
-          <w:szCs w:val="24"/>
-        </w:rPr>
-      </w:pPr>
-      <w:r>
-        <w:rPr>
-          <w:rFonts w:cs="Calibri" w:cstheme="minorHAnsi"/>
-          <w:b w:val="false"/>
-          <w:bCs w:val="false"/>
-          <w:i/>
-          <w:iCs/>
-          <w:color w:val="000000"/>
-          <w:szCs w:val="24"/>
-        </w:rPr>
-        <w:t>7. Course 7:</w:t>
-      </w:r>
-    </w:p>
-    <w:p>
-      <w:pPr>
-        <w:pStyle w:val="Normal"/>
-        <w:spacing w:lineRule="auto" w:line="276" w:before="240" w:after="240"/>
-        <w:jc w:val="center"/>
-        <w:rPr>
-          <w:rFonts w:cs="Calibri" w:cstheme="minorHAnsi"/>
-          <w:b w:val="false"/>
-          <w:bCs w:val="false"/>
-          <w:i/>
-          <w:i/>
-          <w:iCs/>
-          <w:color w:val="000000"/>
-          <w:szCs w:val="24"/>
-        </w:rPr>
-      </w:pPr>
-      <w:r>
-        <w:rPr>
-          <w:rFonts w:cs="Calibri" w:cstheme="minorHAnsi"/>
-          <w:b w:val="false"/>
-          <w:bCs w:val="false"/>
-          <w:i/>
-          <w:iCs/>
-          <w:color w:val="000000"/>
-          <w:szCs w:val="24"/>
-        </w:rPr>
-        <w:t>8. Course 8:</w:t>
-      </w:r>
-    </w:p>
-    <w:p>
-      <w:pPr>
-        <w:pStyle w:val="Normal"/>
-        <w:spacing w:lineRule="auto" w:line="276" w:before="240" w:after="240"/>
-        <w:jc w:val="center"/>
-        <w:rPr>
-          <w:rFonts w:cs="Calibri" w:cstheme="minorHAnsi"/>
-          <w:b w:val="false"/>
-          <w:bCs w:val="false"/>
-          <w:i/>
-          <w:i/>
-          <w:iCs/>
-          <w:color w:val="000000"/>
-          <w:szCs w:val="24"/>
-        </w:rPr>
-      </w:pPr>
-      <w:r>
-        <w:rPr>
-          <w:rFonts w:cs="Calibri" w:cstheme="minorHAnsi"/>
-          <w:b w:val="false"/>
-          <w:bCs w:val="false"/>
-          <w:i/>
-          <w:iCs/>
-          <w:color w:val="000000"/>
-          <w:szCs w:val="24"/>
-        </w:rPr>
-        <w:t>9. Course 9:</w:t>
-      </w:r>
-    </w:p>
-    <w:p>
-      <w:pPr>
-        <w:pStyle w:val="Normal"/>
-        <w:spacing w:lineRule="auto" w:line="276" w:before="240" w:after="240"/>
-        <w:jc w:val="center"/>
-        <w:rPr>
-          <w:rFonts w:cs="Calibri" w:cstheme="minorHAnsi"/>
-          <w:b w:val="false"/>
-          <w:bCs w:val="false"/>
-          <w:i/>
-          <w:i/>
-          <w:iCs/>
-          <w:color w:val="000000"/>
-          <w:szCs w:val="24"/>
-        </w:rPr>
-      </w:pPr>
-      <w:r>
-        <w:rPr>
-          <w:rFonts w:cs="Calibri" w:cstheme="minorHAnsi"/>
-          <w:b w:val="false"/>
-          <w:bCs w:val="false"/>
-          <w:i/>
-          <w:iCs/>
-          <w:color w:val="000000"/>
-          <w:szCs w:val="24"/>
-        </w:rPr>
-        <w:t>10. Course 10:</w:t>
-      </w:r>
-    </w:p>
-    <w:p>
-      <w:pPr>
-        <w:pStyle w:val="Normal"/>
-        <w:spacing w:lineRule="auto" w:line="276" w:before="240" w:after="240"/>
-        <w:jc w:val="center"/>
-        <w:rPr>
-          <w:rFonts w:cs="Calibri" w:cstheme="minorHAnsi"/>
-          <w:b w:val="false"/>
-          <w:bCs w:val="false"/>
-          <w:i/>
-          <w:i/>
-          <w:iCs/>
-          <w:color w:val="000000"/>
-          <w:szCs w:val="24"/>
-        </w:rPr>
-      </w:pPr>
-      <w:r>
-        <w:rPr>
-          <w:rFonts w:cs="Calibri" w:cstheme="minorHAnsi"/>
-          <w:b w:val="false"/>
-          <w:bCs w:val="false"/>
-          <w:i/>
-          <w:iCs/>
-          <w:color w:val="000000"/>
-          <w:szCs w:val="24"/>
-        </w:rPr>
-        <w:t>11. Course 11:</w:t>
-      </w:r>
-    </w:p>
-    <w:p>
-      <w:pPr>
-        <w:pStyle w:val="Normal"/>
-        <w:spacing w:lineRule="auto" w:line="276" w:before="240" w:after="240"/>
-        <w:jc w:val="center"/>
-        <w:rPr>
-          <w:rFonts w:cs="Calibri" w:cstheme="minorHAnsi"/>
-          <w:b w:val="false"/>
-          <w:bCs w:val="false"/>
-          <w:i/>
-          <w:i/>
-          <w:iCs/>
-          <w:color w:val="000000"/>
-          <w:szCs w:val="24"/>
-        </w:rPr>
-      </w:pPr>
-      <w:r>
-        <w:rPr>
-          <w:rFonts w:cs="Calibri" w:cstheme="minorHAnsi"/>
-          <w:b w:val="false"/>
-          <w:bCs w:val="false"/>
-          <w:i/>
-          <w:iCs/>
-          <w:color w:val="000000"/>
-          <w:szCs w:val="24"/>
-        </w:rPr>
-        <w:t>12. Course 12:</w:t>
-      </w:r>
-    </w:p>
-    <w:p>
-      <w:pPr>
-        <w:pStyle w:val="Normal"/>
-        <w:spacing w:lineRule="auto" w:line="276" w:before="240" w:after="240"/>
-        <w:jc w:val="center"/>
-        <w:rPr>
-          <w:rFonts w:cs="Calibri" w:cstheme="minorHAnsi"/>
-          <w:b w:val="false"/>
-          <w:bCs w:val="false"/>
-          <w:i/>
-          <w:i/>
-          <w:iCs/>
-          <w:color w:val="000000"/>
-          <w:szCs w:val="24"/>
-        </w:rPr>
-      </w:pPr>
-      <w:r>
-        <w:rPr>
-          <w:rFonts w:cs="Calibri" w:cstheme="minorHAnsi"/>
-          <w:b w:val="false"/>
-          <w:bCs w:val="false"/>
-          <w:i/>
-          <w:iCs/>
-          <w:color w:val="000000"/>
-          <w:szCs w:val="24"/>
-        </w:rPr>
-        <w:t>13. Course 13:</w:t>
-      </w:r>
-    </w:p>
-    <w:p>
-      <w:pPr>
-        <w:pStyle w:val="Normal"/>
-        <w:spacing w:lineRule="auto" w:line="276" w:before="240" w:after="240"/>
-        <w:jc w:val="center"/>
-        <w:rPr>
-          <w:rFonts w:cs="Calibri" w:cstheme="minorHAnsi"/>
-          <w:b w:val="false"/>
-          <w:bCs w:val="false"/>
-          <w:i/>
-          <w:i/>
-          <w:iCs/>
-          <w:color w:val="000000"/>
-          <w:szCs w:val="24"/>
-        </w:rPr>
-      </w:pPr>
-      <w:r>
-        <w:rPr>
-          <w:rFonts w:cs="Calibri" w:cstheme="minorHAnsi"/>
-          <w:b w:val="false"/>
-          <w:bCs w:val="false"/>
-          <w:i/>
-          <w:iCs/>
-          <w:color w:val="000000"/>
-          <w:szCs w:val="24"/>
-        </w:rPr>
-        <w:t>14. Course 14:</w:t>
-      </w:r>
-    </w:p>
-    <w:p>
-      <w:pPr>
-        <w:pStyle w:val="Normal"/>
-        <w:spacing w:lineRule="auto" w:line="276" w:before="240" w:after="240"/>
-        <w:jc w:val="center"/>
-        <w:rPr>
-          <w:rFonts w:cs="Calibri" w:cstheme="minorHAnsi"/>
-          <w:b w:val="false"/>
-          <w:bCs w:val="false"/>
-          <w:i/>
-          <w:i/>
-          <w:iCs/>
-          <w:color w:val="000000"/>
-          <w:szCs w:val="24"/>
-        </w:rPr>
-      </w:pPr>
-      <w:r>
-        <w:rPr>
-          <w:rFonts w:cs="Calibri" w:cstheme="minorHAnsi"/>
-          <w:b w:val="false"/>
-          <w:bCs w:val="false"/>
-          <w:i/>
-          <w:iCs/>
-          <w:color w:val="000000"/>
-          <w:szCs w:val="24"/>
-        </w:rPr>
-        <w:t>15. Course 15:</w:t>
-      </w:r>
-    </w:p>
-    <w:p>
-      <w:pPr>
-        <w:pStyle w:val="Normal"/>
-        <w:spacing w:lineRule="auto" w:line="276" w:before="240" w:after="240"/>
-        <w:jc w:val="center"/>
-        <w:rPr>
-          <w:rFonts w:cs="Calibri" w:cstheme="minorHAnsi"/>
-          <w:b w:val="false"/>
-          <w:bCs w:val="false"/>
-          <w:i/>
-          <w:i/>
-          <w:iCs/>
-          <w:color w:val="000000"/>
-          <w:szCs w:val="24"/>
-        </w:rPr>
-      </w:pPr>
-      <w:r>
-        <w:rPr>
-          <w:rFonts w:cs="Calibri" w:cstheme="minorHAnsi"/>
-          <w:b w:val="false"/>
-          <w:bCs w:val="false"/>
-          <w:i/>
-          <w:iCs/>
-          <w:color w:val="000000"/>
-          <w:szCs w:val="24"/>
-        </w:rPr>
-        <w:t>16. Course 16:</w:t>
-      </w:r>
-    </w:p>
-    <w:p>
-      <w:pPr>
-        <w:pStyle w:val="Normal"/>
-        <w:spacing w:lineRule="auto" w:line="276" w:before="240" w:after="240"/>
-        <w:jc w:val="center"/>
-        <w:rPr>
-          <w:rFonts w:cs="Calibri" w:cstheme="minorHAnsi"/>
-          <w:b w:val="false"/>
-          <w:bCs w:val="false"/>
-          <w:i/>
-          <w:i/>
-          <w:iCs/>
-          <w:color w:val="000000"/>
-          <w:szCs w:val="24"/>
-        </w:rPr>
-      </w:pPr>
-      <w:r>
-        <w:rPr>
-          <w:rFonts w:cs="Calibri" w:cstheme="minorHAnsi"/>
-          <w:b w:val="false"/>
-          <w:bCs w:val="false"/>
-          <w:i/>
-          <w:iCs/>
-          <w:color w:val="000000"/>
-          <w:szCs w:val="24"/>
-        </w:rPr>
-        <w:t>17. Course 17:</w:t>
-      </w:r>
-    </w:p>
-    <w:p>
-      <w:pPr>
-        <w:pStyle w:val="Normal"/>
-        <w:spacing w:lineRule="auto" w:line="276" w:before="240" w:after="240"/>
-        <w:jc w:val="center"/>
-        <w:rPr>
-          <w:rFonts w:cs="Calibri" w:cstheme="minorHAnsi"/>
-          <w:b w:val="false"/>
-          <w:bCs w:val="false"/>
-          <w:i/>
-          <w:i/>
-          <w:iCs/>
-          <w:color w:val="000000"/>
-          <w:szCs w:val="24"/>
-        </w:rPr>
-      </w:pPr>
-      <w:r>
-        <w:rPr>
-          <w:rFonts w:cs="Calibri" w:cstheme="minorHAnsi"/>
-          <w:b w:val="false"/>
-          <w:bCs w:val="false"/>
-          <w:i/>
-          <w:iCs/>
-          <w:color w:val="000000"/>
-          <w:szCs w:val="24"/>
-        </w:rPr>
-        <w:t>18. Course 18:</w:t>
-      </w:r>
-    </w:p>
-    <w:p>
-      <w:pPr>
-        <w:pStyle w:val="Normal"/>
-        <w:spacing w:lineRule="auto" w:line="276" w:before="240" w:after="240"/>
-        <w:jc w:val="center"/>
-        <w:rPr>
-          <w:rFonts w:cs="Calibri" w:cstheme="minorHAnsi"/>
-          <w:b w:val="false"/>
-          <w:bCs w:val="false"/>
-          <w:i/>
-          <w:i/>
-          <w:iCs/>
-          <w:color w:val="000000"/>
-          <w:szCs w:val="24"/>
-        </w:rPr>
-      </w:pPr>
-      <w:r>
-        <w:rPr>
-          <w:rFonts w:cs="Calibri" w:cstheme="minorHAnsi"/>
-          <w:b w:val="false"/>
-          <w:bCs w:val="false"/>
-          <w:i/>
-          <w:iCs/>
-          <w:color w:val="000000"/>
-          <w:szCs w:val="24"/>
-        </w:rPr>
-        <w:t>19. Course 19:</w:t>
-      </w:r>
-    </w:p>
-    <w:p>
-      <w:pPr>
-        <w:pStyle w:val="Normal"/>
-        <w:spacing w:lineRule="auto" w:line="276" w:before="240" w:after="240"/>
-        <w:jc w:val="center"/>
-        <w:rPr>
-          <w:rFonts w:cs="Calibri" w:cstheme="minorHAnsi"/>
-          <w:b w:val="false"/>
-          <w:bCs w:val="false"/>
-          <w:i/>
-          <w:i/>
-          <w:iCs/>
-          <w:color w:val="000000"/>
-          <w:szCs w:val="24"/>
-        </w:rPr>
-      </w:pPr>
-      <w:r>
-        <w:rPr>
-          <w:rFonts w:cs="Calibri" w:cstheme="minorHAnsi"/>
-          <w:b w:val="false"/>
-          <w:bCs w:val="false"/>
-          <w:i/>
-          <w:iCs/>
-          <w:color w:val="000000"/>
-          <w:szCs w:val="24"/>
-        </w:rPr>
-        <w:t>20. Course 20:</w:t>
+        <w:rPr/>
+        <w:t>https://docs.google.com/forms/d/e/1FAIpQLSclmDbKT1N4lTgv0f9O6mcqZYT5fAIXhb5qP-gPJktH_h75QQ/viewform</w:t>
       </w:r>
     </w:p>
     <w:sectPr>
@@ -797,7 +182,7 @@
     <w:r>
       <w:rPr/>
       <w:drawing>
-        <wp:anchor behindDoc="0" distT="0" distB="0" distL="114300" distR="114300" simplePos="0" locked="0" layoutInCell="0" allowOverlap="1" relativeHeight="3">
+        <wp:anchor behindDoc="0" distT="0" distB="0" distL="114300" distR="114300" simplePos="0" locked="0" layoutInCell="0" allowOverlap="1" relativeHeight="2">
           <wp:simplePos x="0" y="0"/>
           <wp:positionH relativeFrom="column">
             <wp:posOffset>-390525</wp:posOffset>
@@ -810,9 +195,9 @@
           <wp:wrapTight wrapText="bothSides">
             <wp:wrapPolygon edited="0">
               <wp:start x="-12" y="0"/>
-              <wp:lineTo x="-12" y="20820"/>
-              <wp:lineTo x="21447" y="20820"/>
-              <wp:lineTo x="21447" y="0"/>
+              <wp:lineTo x="-12" y="20783"/>
+              <wp:lineTo x="21435" y="20783"/>
+              <wp:lineTo x="21435" y="0"/>
               <wp:lineTo x="-12" y="0"/>
             </wp:wrapPolygon>
           </wp:wrapTight>
@@ -865,7 +250,7 @@
     <w:r>
       <w:rPr/>
       <w:drawing>
-        <wp:anchor behindDoc="0" distT="0" distB="0" distL="114300" distR="114300" simplePos="0" locked="0" layoutInCell="0" allowOverlap="1" relativeHeight="3">
+        <wp:anchor behindDoc="0" distT="0" distB="0" distL="114300" distR="114300" simplePos="0" locked="0" layoutInCell="0" allowOverlap="1" relativeHeight="2">
           <wp:simplePos x="0" y="0"/>
           <wp:positionH relativeFrom="column">
             <wp:posOffset>-390525</wp:posOffset>
@@ -878,9 +263,9 @@
           <wp:wrapTight wrapText="bothSides">
             <wp:wrapPolygon edited="0">
               <wp:start x="-12" y="0"/>
-              <wp:lineTo x="-12" y="20820"/>
-              <wp:lineTo x="21447" y="20820"/>
-              <wp:lineTo x="21447" y="0"/>
+              <wp:lineTo x="-12" y="20783"/>
+              <wp:lineTo x="21435" y="20783"/>
+              <wp:lineTo x="21435" y="0"/>
               <wp:lineTo x="-12" y="0"/>
             </wp:wrapPolygon>
           </wp:wrapTight>

</xml_diff>